<commit_message>
docs(database): update ERD diagram in design doc
</commit_message>
<xml_diff>
--- a/DOCX/Phần DOCX.docx
+++ b/DOCX/Phần DOCX.docx
@@ -10,529 +10,573 @@
           <w:szCs w:val="26"/>
         </w:rPr>
       </w:pPr>
+      <w:r>
+        <w:rPr>
+          <w:rFonts w:hint="default" w:ascii="Times New Roman" w:hAnsi="Times New Roman" w:cs="Times New Roman"/>
+          <w:sz w:val="26"/>
+          <w:szCs w:val="26"/>
+        </w:rPr>
+        <w:t>Phần DOCX:</w:t>
+      </w:r>
+    </w:p>
+    <w:p>
+      <w:pPr>
+        <w:rPr>
+          <w:rFonts w:hint="default" w:ascii="Times New Roman" w:hAnsi="Times New Roman" w:cs="Times New Roman"/>
+          <w:sz w:val="26"/>
+          <w:szCs w:val="26"/>
+        </w:rPr>
+      </w:pPr>
+      <w:r>
+        <w:rPr>
+          <w:rFonts w:hint="default" w:ascii="Times New Roman" w:hAnsi="Times New Roman" w:cs="Times New Roman"/>
+          <w:sz w:val="26"/>
+          <w:szCs w:val="26"/>
+        </w:rPr>
+        <w:t>Thiết kế DATABASE</w:t>
+      </w:r>
+    </w:p>
+    <w:p>
+      <w:pPr>
+        <w:rPr>
+          <w:rFonts w:hint="default" w:ascii="Times New Roman" w:hAnsi="Times New Roman" w:cs="Times New Roman"/>
+          <w:sz w:val="26"/>
+          <w:szCs w:val="26"/>
+        </w:rPr>
+      </w:pPr>
+    </w:p>
+    <w:p>
+      <w:pPr>
+        <w:rPr>
+          <w:rFonts w:hint="default" w:ascii="Times New Roman" w:hAnsi="Times New Roman" w:cs="Times New Roman"/>
+          <w:sz w:val="26"/>
+          <w:szCs w:val="26"/>
+        </w:rPr>
+      </w:pPr>
+      <w:r>
+        <w:rPr>
+          <w:rFonts w:hint="default" w:ascii="Times New Roman" w:hAnsi="Times New Roman" w:cs="Times New Roman"/>
+          <w:sz w:val="26"/>
+          <w:szCs w:val="26"/>
+        </w:rPr>
+        <w:t>CREATE TABLE [User] (</w:t>
+      </w:r>
+    </w:p>
+    <w:p>
+      <w:pPr>
+        <w:rPr>
+          <w:rFonts w:hint="default" w:ascii="Times New Roman" w:hAnsi="Times New Roman" w:cs="Times New Roman"/>
+          <w:sz w:val="26"/>
+          <w:szCs w:val="26"/>
+        </w:rPr>
+      </w:pPr>
+      <w:r>
+        <w:rPr>
+          <w:rFonts w:hint="default" w:ascii="Times New Roman" w:hAnsi="Times New Roman" w:cs="Times New Roman"/>
+          <w:sz w:val="26"/>
+          <w:szCs w:val="26"/>
+        </w:rPr>
+        <w:t xml:space="preserve">    UserId INT IDENTITY(1,1) PRIMARY KEY,</w:t>
+      </w:r>
+    </w:p>
+    <w:p>
+      <w:pPr>
+        <w:rPr>
+          <w:rFonts w:hint="default" w:ascii="Times New Roman" w:hAnsi="Times New Roman" w:cs="Times New Roman"/>
+          <w:sz w:val="26"/>
+          <w:szCs w:val="26"/>
+        </w:rPr>
+      </w:pPr>
+      <w:r>
+        <w:rPr>
+          <w:rFonts w:hint="default" w:ascii="Times New Roman" w:hAnsi="Times New Roman" w:cs="Times New Roman"/>
+          <w:sz w:val="26"/>
+          <w:szCs w:val="26"/>
+        </w:rPr>
+        <w:t xml:space="preserve">    Username VARCHAR(50) NOT NULL UNIQUE,</w:t>
+      </w:r>
+    </w:p>
+    <w:p>
+      <w:pPr>
+        <w:rPr>
+          <w:rFonts w:hint="default" w:ascii="Times New Roman" w:hAnsi="Times New Roman" w:cs="Times New Roman"/>
+          <w:sz w:val="26"/>
+          <w:szCs w:val="26"/>
+        </w:rPr>
+      </w:pPr>
+      <w:r>
+        <w:rPr>
+          <w:rFonts w:hint="default" w:ascii="Times New Roman" w:hAnsi="Times New Roman" w:cs="Times New Roman"/>
+          <w:sz w:val="26"/>
+          <w:szCs w:val="26"/>
+        </w:rPr>
+        <w:t xml:space="preserve">    Password VARCHAR(100) NOT NULL,</w:t>
+      </w:r>
+    </w:p>
+    <w:p>
+      <w:pPr>
+        <w:rPr>
+          <w:rFonts w:hint="default" w:ascii="Times New Roman" w:hAnsi="Times New Roman" w:cs="Times New Roman"/>
+          <w:sz w:val="26"/>
+          <w:szCs w:val="26"/>
+        </w:rPr>
+      </w:pPr>
+      <w:r>
+        <w:rPr>
+          <w:rFonts w:hint="default" w:ascii="Times New Roman" w:hAnsi="Times New Roman" w:cs="Times New Roman"/>
+          <w:sz w:val="26"/>
+          <w:szCs w:val="26"/>
+        </w:rPr>
+        <w:t xml:space="preserve">    DisplayName NVARCHAR(100) NOT NULL,</w:t>
+      </w:r>
+    </w:p>
+    <w:p>
+      <w:pPr>
+        <w:rPr>
+          <w:rFonts w:hint="default" w:ascii="Times New Roman" w:hAnsi="Times New Roman" w:cs="Times New Roman"/>
+          <w:sz w:val="26"/>
+          <w:szCs w:val="26"/>
+        </w:rPr>
+      </w:pPr>
+      <w:r>
+        <w:rPr>
+          <w:rFonts w:hint="default" w:ascii="Times New Roman" w:hAnsi="Times New Roman" w:cs="Times New Roman"/>
+          <w:sz w:val="26"/>
+          <w:szCs w:val="26"/>
+        </w:rPr>
+        <w:t xml:space="preserve">    WinCount INT DEFAULT 0,</w:t>
+      </w:r>
+    </w:p>
+    <w:p>
+      <w:pPr>
+        <w:rPr>
+          <w:rFonts w:hint="default" w:ascii="Times New Roman" w:hAnsi="Times New Roman" w:cs="Times New Roman"/>
+          <w:sz w:val="26"/>
+          <w:szCs w:val="26"/>
+        </w:rPr>
+      </w:pPr>
+      <w:r>
+        <w:rPr>
+          <w:rFonts w:hint="default" w:ascii="Times New Roman" w:hAnsi="Times New Roman" w:cs="Times New Roman"/>
+          <w:sz w:val="26"/>
+          <w:szCs w:val="26"/>
+        </w:rPr>
+        <w:t xml:space="preserve">    LossCount INT DEFAULT 0</w:t>
+      </w:r>
+    </w:p>
+    <w:p>
+      <w:pPr>
+        <w:rPr>
+          <w:rFonts w:hint="default" w:ascii="Times New Roman" w:hAnsi="Times New Roman" w:cs="Times New Roman"/>
+          <w:sz w:val="26"/>
+          <w:szCs w:val="26"/>
+        </w:rPr>
+      </w:pPr>
+      <w:r>
+        <w:rPr>
+          <w:rFonts w:hint="default" w:ascii="Times New Roman" w:hAnsi="Times New Roman" w:cs="Times New Roman"/>
+          <w:sz w:val="26"/>
+          <w:szCs w:val="26"/>
+        </w:rPr>
+        <w:t>);</w:t>
+      </w:r>
+    </w:p>
+    <w:p>
+      <w:pPr>
+        <w:rPr>
+          <w:rFonts w:hint="default" w:ascii="Times New Roman" w:hAnsi="Times New Roman" w:cs="Times New Roman"/>
+          <w:sz w:val="26"/>
+          <w:szCs w:val="26"/>
+        </w:rPr>
+      </w:pPr>
+    </w:p>
+    <w:p>
+      <w:pPr>
+        <w:rPr>
+          <w:rFonts w:hint="default" w:ascii="Times New Roman" w:hAnsi="Times New Roman" w:cs="Times New Roman"/>
+          <w:sz w:val="26"/>
+          <w:szCs w:val="26"/>
+        </w:rPr>
+      </w:pPr>
+      <w:r>
+        <w:rPr>
+          <w:rFonts w:hint="default" w:ascii="Times New Roman" w:hAnsi="Times New Roman" w:cs="Times New Roman"/>
+          <w:sz w:val="26"/>
+          <w:szCs w:val="26"/>
+        </w:rPr>
+        <w:t>CREATE TABLE [Match] (</w:t>
+      </w:r>
+    </w:p>
+    <w:p>
+      <w:pPr>
+        <w:rPr>
+          <w:rFonts w:hint="default" w:ascii="Times New Roman" w:hAnsi="Times New Roman" w:cs="Times New Roman"/>
+          <w:sz w:val="26"/>
+          <w:szCs w:val="26"/>
+        </w:rPr>
+      </w:pPr>
+      <w:r>
+        <w:rPr>
+          <w:rFonts w:hint="default" w:ascii="Times New Roman" w:hAnsi="Times New Roman" w:cs="Times New Roman"/>
+          <w:sz w:val="26"/>
+          <w:szCs w:val="26"/>
+        </w:rPr>
+        <w:t xml:space="preserve">    MatchId INT IDENTITY(1,1) PRIMARY KEY,</w:t>
+      </w:r>
+    </w:p>
+    <w:p>
+      <w:pPr>
+        <w:rPr>
+          <w:rFonts w:hint="default" w:ascii="Times New Roman" w:hAnsi="Times New Roman" w:cs="Times New Roman"/>
+          <w:sz w:val="26"/>
+          <w:szCs w:val="26"/>
+        </w:rPr>
+      </w:pPr>
+      <w:r>
+        <w:rPr>
+          <w:rFonts w:hint="default" w:ascii="Times New Roman" w:hAnsi="Times New Roman" w:cs="Times New Roman"/>
+          <w:sz w:val="26"/>
+          <w:szCs w:val="26"/>
+        </w:rPr>
+        <w:t xml:space="preserve">    Player1Id INT NOT NULL FOREIGN KEY REFERENCES [User](UserId),</w:t>
+      </w:r>
+    </w:p>
+    <w:p>
+      <w:pPr>
+        <w:rPr>
+          <w:rFonts w:hint="default" w:ascii="Times New Roman" w:hAnsi="Times New Roman" w:cs="Times New Roman"/>
+          <w:sz w:val="26"/>
+          <w:szCs w:val="26"/>
+        </w:rPr>
+      </w:pPr>
+      <w:r>
+        <w:rPr>
+          <w:rFonts w:hint="default" w:ascii="Times New Roman" w:hAnsi="Times New Roman" w:cs="Times New Roman"/>
+          <w:sz w:val="26"/>
+          <w:szCs w:val="26"/>
+        </w:rPr>
+        <w:t xml:space="preserve">    Player2Id INT NOT NULL FOREIGN KEY REFERENCES [User](UserId),</w:t>
+      </w:r>
+    </w:p>
+    <w:p>
+      <w:pPr>
+        <w:rPr>
+          <w:rFonts w:hint="default" w:ascii="Times New Roman" w:hAnsi="Times New Roman" w:cs="Times New Roman"/>
+          <w:sz w:val="26"/>
+          <w:szCs w:val="26"/>
+        </w:rPr>
+      </w:pPr>
+      <w:r>
+        <w:rPr>
+          <w:rFonts w:hint="default" w:ascii="Times New Roman" w:hAnsi="Times New Roman" w:cs="Times New Roman"/>
+          <w:sz w:val="26"/>
+          <w:szCs w:val="26"/>
+        </w:rPr>
+        <w:t xml:space="preserve">    WinnerId INT NULL FOREIGN KEY REFERENCES [User](UserId),</w:t>
+      </w:r>
+    </w:p>
+    <w:p>
+      <w:pPr>
+        <w:rPr>
+          <w:rFonts w:hint="default" w:ascii="Times New Roman" w:hAnsi="Times New Roman" w:cs="Times New Roman"/>
+          <w:sz w:val="26"/>
+          <w:szCs w:val="26"/>
+        </w:rPr>
+      </w:pPr>
+      <w:r>
+        <w:rPr>
+          <w:rFonts w:hint="default" w:ascii="Times New Roman" w:hAnsi="Times New Roman" w:cs="Times New Roman"/>
+          <w:sz w:val="26"/>
+          <w:szCs w:val="26"/>
+        </w:rPr>
+        <w:t xml:space="preserve">    StartTime DATETIME DEFAULT GETDATE(),</w:t>
+      </w:r>
+    </w:p>
+    <w:p>
+      <w:pPr>
+        <w:rPr>
+          <w:rFonts w:hint="default" w:ascii="Times New Roman" w:hAnsi="Times New Roman" w:cs="Times New Roman"/>
+          <w:sz w:val="26"/>
+          <w:szCs w:val="26"/>
+        </w:rPr>
+      </w:pPr>
+      <w:r>
+        <w:rPr>
+          <w:rFonts w:hint="default" w:ascii="Times New Roman" w:hAnsi="Times New Roman" w:cs="Times New Roman"/>
+          <w:sz w:val="26"/>
+          <w:szCs w:val="26"/>
+        </w:rPr>
+        <w:t xml:space="preserve">    EndTime DATETIME NULL</w:t>
+      </w:r>
+    </w:p>
+    <w:p>
+      <w:pPr>
+        <w:rPr>
+          <w:rFonts w:hint="default" w:ascii="Times New Roman" w:hAnsi="Times New Roman" w:cs="Times New Roman"/>
+          <w:sz w:val="26"/>
+          <w:szCs w:val="26"/>
+        </w:rPr>
+      </w:pPr>
+      <w:r>
+        <w:rPr>
+          <w:rFonts w:hint="default" w:ascii="Times New Roman" w:hAnsi="Times New Roman" w:cs="Times New Roman"/>
+          <w:sz w:val="26"/>
+          <w:szCs w:val="26"/>
+        </w:rPr>
+        <w:t>);</w:t>
+      </w:r>
+    </w:p>
+    <w:p>
+      <w:pPr>
+        <w:rPr>
+          <w:rFonts w:hint="default" w:ascii="Times New Roman" w:hAnsi="Times New Roman" w:cs="Times New Roman"/>
+          <w:sz w:val="26"/>
+          <w:szCs w:val="26"/>
+        </w:rPr>
+      </w:pPr>
+    </w:p>
+    <w:p>
+      <w:pPr>
+        <w:rPr>
+          <w:rFonts w:hint="default" w:ascii="Times New Roman" w:hAnsi="Times New Roman" w:cs="Times New Roman"/>
+          <w:sz w:val="26"/>
+          <w:szCs w:val="26"/>
+        </w:rPr>
+      </w:pPr>
+      <w:r>
+        <w:rPr>
+          <w:rFonts w:hint="default" w:ascii="Times New Roman" w:hAnsi="Times New Roman" w:cs="Times New Roman"/>
+          <w:sz w:val="26"/>
+          <w:szCs w:val="26"/>
+        </w:rPr>
+        <w:t>CREATE TABLE [History] (</w:t>
+      </w:r>
+    </w:p>
+    <w:p>
+      <w:pPr>
+        <w:rPr>
+          <w:rFonts w:hint="default" w:ascii="Times New Roman" w:hAnsi="Times New Roman" w:cs="Times New Roman"/>
+          <w:sz w:val="26"/>
+          <w:szCs w:val="26"/>
+        </w:rPr>
+      </w:pPr>
+      <w:r>
+        <w:rPr>
+          <w:rFonts w:hint="default" w:ascii="Times New Roman" w:hAnsi="Times New Roman" w:cs="Times New Roman"/>
+          <w:sz w:val="26"/>
+          <w:szCs w:val="26"/>
+        </w:rPr>
+        <w:t xml:space="preserve">    HistoryId INT IDENTITY(1,1) PRIMARY KEY,</w:t>
+      </w:r>
+    </w:p>
+    <w:p>
+      <w:pPr>
+        <w:rPr>
+          <w:rFonts w:hint="default" w:ascii="Times New Roman" w:hAnsi="Times New Roman" w:cs="Times New Roman"/>
+          <w:sz w:val="26"/>
+          <w:szCs w:val="26"/>
+        </w:rPr>
+      </w:pPr>
+      <w:r>
+        <w:rPr>
+          <w:rFonts w:hint="default" w:ascii="Times New Roman" w:hAnsi="Times New Roman" w:cs="Times New Roman"/>
+          <w:sz w:val="26"/>
+          <w:szCs w:val="26"/>
+        </w:rPr>
+        <w:t xml:space="preserve">    MatchId INT NOT NULL FOREIGN KEY REFERENCES [Match](MatchId),</w:t>
+      </w:r>
+    </w:p>
+    <w:p>
+      <w:pPr>
+        <w:rPr>
+          <w:rFonts w:hint="default" w:ascii="Times New Roman" w:hAnsi="Times New Roman" w:cs="Times New Roman"/>
+          <w:sz w:val="26"/>
+          <w:szCs w:val="26"/>
+        </w:rPr>
+      </w:pPr>
+      <w:r>
+        <w:rPr>
+          <w:rFonts w:hint="default" w:ascii="Times New Roman" w:hAnsi="Times New Roman" w:cs="Times New Roman"/>
+          <w:sz w:val="26"/>
+          <w:szCs w:val="26"/>
+        </w:rPr>
+        <w:t xml:space="preserve">    PlayerId INT NOT NULL FOREIGN KEY REFERENCES [User](UserId),</w:t>
+      </w:r>
+    </w:p>
+    <w:p>
+      <w:pPr>
+        <w:rPr>
+          <w:rFonts w:hint="default" w:ascii="Times New Roman" w:hAnsi="Times New Roman" w:cs="Times New Roman"/>
+          <w:sz w:val="26"/>
+          <w:szCs w:val="26"/>
+        </w:rPr>
+      </w:pPr>
+      <w:r>
+        <w:rPr>
+          <w:rFonts w:hint="default" w:ascii="Times New Roman" w:hAnsi="Times New Roman" w:cs="Times New Roman"/>
+          <w:sz w:val="26"/>
+          <w:szCs w:val="26"/>
+        </w:rPr>
+        <w:t xml:space="preserve">    MoveX INT NOT NULL,</w:t>
+      </w:r>
+    </w:p>
+    <w:p>
+      <w:pPr>
+        <w:rPr>
+          <w:rFonts w:hint="default" w:ascii="Times New Roman" w:hAnsi="Times New Roman" w:cs="Times New Roman"/>
+          <w:sz w:val="26"/>
+          <w:szCs w:val="26"/>
+        </w:rPr>
+      </w:pPr>
+      <w:r>
+        <w:rPr>
+          <w:rFonts w:hint="default" w:ascii="Times New Roman" w:hAnsi="Times New Roman" w:cs="Times New Roman"/>
+          <w:sz w:val="26"/>
+          <w:szCs w:val="26"/>
+        </w:rPr>
+        <w:t xml:space="preserve">    MoveY INT NOT NULL,</w:t>
+      </w:r>
+    </w:p>
+    <w:p>
+      <w:pPr>
+        <w:rPr>
+          <w:rFonts w:hint="default" w:ascii="Times New Roman" w:hAnsi="Times New Roman" w:cs="Times New Roman"/>
+          <w:sz w:val="26"/>
+          <w:szCs w:val="26"/>
+        </w:rPr>
+      </w:pPr>
+      <w:r>
+        <w:rPr>
+          <w:rFonts w:hint="default" w:ascii="Times New Roman" w:hAnsi="Times New Roman" w:cs="Times New Roman"/>
+          <w:sz w:val="26"/>
+          <w:szCs w:val="26"/>
+        </w:rPr>
+        <w:t xml:space="preserve">    StepOrder INT NOT NULL</w:t>
+      </w:r>
+    </w:p>
+    <w:p>
+      <w:pPr>
+        <w:rPr>
+          <w:rFonts w:hint="default" w:ascii="Times New Roman" w:hAnsi="Times New Roman" w:cs="Times New Roman"/>
+          <w:sz w:val="26"/>
+          <w:szCs w:val="26"/>
+        </w:rPr>
+      </w:pPr>
+      <w:r>
+        <w:rPr>
+          <w:rFonts w:hint="default" w:ascii="Times New Roman" w:hAnsi="Times New Roman" w:cs="Times New Roman"/>
+          <w:sz w:val="26"/>
+          <w:szCs w:val="26"/>
+        </w:rPr>
+        <w:t>);</w:t>
+      </w:r>
+    </w:p>
+    <w:p>
+      <w:pPr>
+        <w:rPr>
+          <w:rFonts w:hint="default" w:ascii="Times New Roman" w:hAnsi="Times New Roman" w:cs="Times New Roman"/>
+          <w:sz w:val="26"/>
+          <w:szCs w:val="26"/>
+        </w:rPr>
+      </w:pPr>
+    </w:p>
+    <w:p>
+      <w:pPr>
+        <w:rPr>
+          <w:rFonts w:hint="default" w:ascii="Times New Roman" w:hAnsi="Times New Roman" w:cs="Times New Roman"/>
+          <w:sz w:val="26"/>
+          <w:szCs w:val="26"/>
+        </w:rPr>
+      </w:pPr>
+      <w:r>
+        <w:rPr>
+          <w:rFonts w:hint="default" w:ascii="Times New Roman" w:hAnsi="Times New Roman" w:cs="Times New Roman"/>
+          <w:sz w:val="26"/>
+          <w:szCs w:val="26"/>
+        </w:rPr>
+        <w:t>Đây là ERD mình vẽ, leader check lỗi giúp mình ạ</w:t>
+      </w:r>
+    </w:p>
+    <w:p>
+      <w:r>
+        <w:drawing>
+          <wp:inline distT="0" distB="0" distL="114300" distR="114300">
+            <wp:extent cx="5753735" cy="3307715"/>
+            <wp:effectExtent l="0" t="0" r="6985" b="14605"/>
+            <wp:docPr id="1" name="Picture 1"/>
+            <wp:cNvGraphicFramePr>
+              <a:graphicFrameLocks xmlns:a="http://schemas.openxmlformats.org/drawingml/2006/main" noChangeAspect="1"/>
+            </wp:cNvGraphicFramePr>
+            <a:graphic xmlns:a="http://schemas.openxmlformats.org/drawingml/2006/main">
+              <a:graphicData uri="http://schemas.openxmlformats.org/drawingml/2006/picture">
+                <pic:pic xmlns:pic="http://schemas.openxmlformats.org/drawingml/2006/picture">
+                  <pic:nvPicPr>
+                    <pic:cNvPr id="1" name="Picture 1"/>
+                    <pic:cNvPicPr>
+                      <a:picLocks noChangeAspect="1"/>
+                    </pic:cNvPicPr>
+                  </pic:nvPicPr>
+                  <pic:blipFill>
+                    <a:blip r:embed="rId4"/>
+                    <a:stretch>
+                      <a:fillRect/>
+                    </a:stretch>
+                  </pic:blipFill>
+                  <pic:spPr>
+                    <a:xfrm>
+                      <a:off x="0" y="0"/>
+                      <a:ext cx="5753735" cy="3307715"/>
+                    </a:xfrm>
+                    <a:prstGeom prst="rect">
+                      <a:avLst/>
+                    </a:prstGeom>
+                    <a:noFill/>
+                    <a:ln>
+                      <a:noFill/>
+                    </a:ln>
+                  </pic:spPr>
+                </pic:pic>
+              </a:graphicData>
+            </a:graphic>
+          </wp:inline>
+        </w:drawing>
+      </w:r>
+    </w:p>
+    <w:p/>
+    <w:p>
+      <w:pPr>
+        <w:rPr>
+          <w:rFonts w:hint="default"/>
+          <w:lang w:val="en-US"/>
+        </w:rPr>
+      </w:pPr>
+      <w:r>
+        <w:rPr>
+          <w:rFonts w:hint="default"/>
+          <w:lang w:val="en-US"/>
+        </w:rPr>
+        <w:t xml:space="preserve"> Link: https://drive.google.com/file/d/1yWp8Gn_E_fndncQBrgFwo2yUqkDR-cpW/view?usp=sharing</w:t>
+      </w:r>
+    </w:p>
+    <w:p>
+      <w:pPr>
+        <w:rPr>
+          <w:rFonts w:hint="default" w:ascii="Times New Roman" w:hAnsi="Times New Roman" w:cs="Times New Roman"/>
+          <w:sz w:val="26"/>
+          <w:szCs w:val="26"/>
+        </w:rPr>
+      </w:pPr>
+    </w:p>
+    <w:p>
+      <w:pPr>
+        <w:rPr>
+          <w:rFonts w:hint="default" w:ascii="Times New Roman" w:hAnsi="Times New Roman" w:cs="Times New Roman"/>
+          <w:sz w:val="26"/>
+          <w:szCs w:val="26"/>
+        </w:rPr>
+      </w:pPr>
       <w:bookmarkStart w:id="0" w:name="_GoBack"/>
       <w:bookmarkEnd w:id="0"/>
-      <w:r>
-        <w:rPr>
-          <w:rFonts w:hint="default" w:ascii="Times New Roman" w:hAnsi="Times New Roman" w:cs="Times New Roman"/>
-          <w:sz w:val="26"/>
-          <w:szCs w:val="26"/>
-        </w:rPr>
-        <w:t>Phần DOCX:</w:t>
-      </w:r>
-    </w:p>
-    <w:p>
-      <w:pPr>
-        <w:rPr>
-          <w:rFonts w:hint="default" w:ascii="Times New Roman" w:hAnsi="Times New Roman" w:cs="Times New Roman"/>
-          <w:sz w:val="26"/>
-          <w:szCs w:val="26"/>
-        </w:rPr>
-      </w:pPr>
-      <w:r>
-        <w:rPr>
-          <w:rFonts w:hint="default" w:ascii="Times New Roman" w:hAnsi="Times New Roman" w:cs="Times New Roman"/>
-          <w:sz w:val="26"/>
-          <w:szCs w:val="26"/>
-        </w:rPr>
-        <w:t>Thiết kế DATABASE</w:t>
-      </w:r>
-    </w:p>
-    <w:p>
-      <w:pPr>
-        <w:rPr>
-          <w:rFonts w:hint="default" w:ascii="Times New Roman" w:hAnsi="Times New Roman" w:cs="Times New Roman"/>
-          <w:sz w:val="26"/>
-          <w:szCs w:val="26"/>
-        </w:rPr>
-      </w:pPr>
-    </w:p>
-    <w:p>
-      <w:pPr>
-        <w:rPr>
-          <w:rFonts w:hint="default" w:ascii="Times New Roman" w:hAnsi="Times New Roman" w:cs="Times New Roman"/>
-          <w:sz w:val="26"/>
-          <w:szCs w:val="26"/>
-        </w:rPr>
-      </w:pPr>
-      <w:r>
-        <w:rPr>
-          <w:rFonts w:hint="default" w:ascii="Times New Roman" w:hAnsi="Times New Roman" w:cs="Times New Roman"/>
-          <w:sz w:val="26"/>
-          <w:szCs w:val="26"/>
-        </w:rPr>
-        <w:t>CREATE TABLE [User] (</w:t>
-      </w:r>
-    </w:p>
-    <w:p>
-      <w:pPr>
-        <w:rPr>
-          <w:rFonts w:hint="default" w:ascii="Times New Roman" w:hAnsi="Times New Roman" w:cs="Times New Roman"/>
-          <w:sz w:val="26"/>
-          <w:szCs w:val="26"/>
-        </w:rPr>
-      </w:pPr>
-      <w:r>
-        <w:rPr>
-          <w:rFonts w:hint="default" w:ascii="Times New Roman" w:hAnsi="Times New Roman" w:cs="Times New Roman"/>
-          <w:sz w:val="26"/>
-          <w:szCs w:val="26"/>
-        </w:rPr>
-        <w:t xml:space="preserve">    UserId INT IDENTITY(1,1) PRIMARY KEY,</w:t>
-      </w:r>
-    </w:p>
-    <w:p>
-      <w:pPr>
-        <w:rPr>
-          <w:rFonts w:hint="default" w:ascii="Times New Roman" w:hAnsi="Times New Roman" w:cs="Times New Roman"/>
-          <w:sz w:val="26"/>
-          <w:szCs w:val="26"/>
-        </w:rPr>
-      </w:pPr>
-      <w:r>
-        <w:rPr>
-          <w:rFonts w:hint="default" w:ascii="Times New Roman" w:hAnsi="Times New Roman" w:cs="Times New Roman"/>
-          <w:sz w:val="26"/>
-          <w:szCs w:val="26"/>
-        </w:rPr>
-        <w:t xml:space="preserve">    Username VARCHAR(50) NOT NULL UNIQUE,</w:t>
-      </w:r>
-    </w:p>
-    <w:p>
-      <w:pPr>
-        <w:rPr>
-          <w:rFonts w:hint="default" w:ascii="Times New Roman" w:hAnsi="Times New Roman" w:cs="Times New Roman"/>
-          <w:sz w:val="26"/>
-          <w:szCs w:val="26"/>
-        </w:rPr>
-      </w:pPr>
-      <w:r>
-        <w:rPr>
-          <w:rFonts w:hint="default" w:ascii="Times New Roman" w:hAnsi="Times New Roman" w:cs="Times New Roman"/>
-          <w:sz w:val="26"/>
-          <w:szCs w:val="26"/>
-        </w:rPr>
-        <w:t xml:space="preserve">    Password VARCHAR(100) NOT NULL,</w:t>
-      </w:r>
-    </w:p>
-    <w:p>
-      <w:pPr>
-        <w:rPr>
-          <w:rFonts w:hint="default" w:ascii="Times New Roman" w:hAnsi="Times New Roman" w:cs="Times New Roman"/>
-          <w:sz w:val="26"/>
-          <w:szCs w:val="26"/>
-        </w:rPr>
-      </w:pPr>
-      <w:r>
-        <w:rPr>
-          <w:rFonts w:hint="default" w:ascii="Times New Roman" w:hAnsi="Times New Roman" w:cs="Times New Roman"/>
-          <w:sz w:val="26"/>
-          <w:szCs w:val="26"/>
-        </w:rPr>
-        <w:t xml:space="preserve">    DisplayName NVARCHAR(100) NOT NULL,</w:t>
-      </w:r>
-    </w:p>
-    <w:p>
-      <w:pPr>
-        <w:rPr>
-          <w:rFonts w:hint="default" w:ascii="Times New Roman" w:hAnsi="Times New Roman" w:cs="Times New Roman"/>
-          <w:sz w:val="26"/>
-          <w:szCs w:val="26"/>
-        </w:rPr>
-      </w:pPr>
-      <w:r>
-        <w:rPr>
-          <w:rFonts w:hint="default" w:ascii="Times New Roman" w:hAnsi="Times New Roman" w:cs="Times New Roman"/>
-          <w:sz w:val="26"/>
-          <w:szCs w:val="26"/>
-        </w:rPr>
-        <w:t xml:space="preserve">    WinCount INT DEFAULT 0,</w:t>
-      </w:r>
-    </w:p>
-    <w:p>
-      <w:pPr>
-        <w:rPr>
-          <w:rFonts w:hint="default" w:ascii="Times New Roman" w:hAnsi="Times New Roman" w:cs="Times New Roman"/>
-          <w:sz w:val="26"/>
-          <w:szCs w:val="26"/>
-        </w:rPr>
-      </w:pPr>
-      <w:r>
-        <w:rPr>
-          <w:rFonts w:hint="default" w:ascii="Times New Roman" w:hAnsi="Times New Roman" w:cs="Times New Roman"/>
-          <w:sz w:val="26"/>
-          <w:szCs w:val="26"/>
-        </w:rPr>
-        <w:t xml:space="preserve">    LossCount INT DEFAULT 0</w:t>
-      </w:r>
-    </w:p>
-    <w:p>
-      <w:pPr>
-        <w:rPr>
-          <w:rFonts w:hint="default" w:ascii="Times New Roman" w:hAnsi="Times New Roman" w:cs="Times New Roman"/>
-          <w:sz w:val="26"/>
-          <w:szCs w:val="26"/>
-        </w:rPr>
-      </w:pPr>
-      <w:r>
-        <w:rPr>
-          <w:rFonts w:hint="default" w:ascii="Times New Roman" w:hAnsi="Times New Roman" w:cs="Times New Roman"/>
-          <w:sz w:val="26"/>
-          <w:szCs w:val="26"/>
-        </w:rPr>
-        <w:t>);</w:t>
-      </w:r>
-    </w:p>
-    <w:p>
-      <w:pPr>
-        <w:rPr>
-          <w:rFonts w:hint="default" w:ascii="Times New Roman" w:hAnsi="Times New Roman" w:cs="Times New Roman"/>
-          <w:sz w:val="26"/>
-          <w:szCs w:val="26"/>
-        </w:rPr>
-      </w:pPr>
-    </w:p>
-    <w:p>
-      <w:pPr>
-        <w:rPr>
-          <w:rFonts w:hint="default" w:ascii="Times New Roman" w:hAnsi="Times New Roman" w:cs="Times New Roman"/>
-          <w:sz w:val="26"/>
-          <w:szCs w:val="26"/>
-        </w:rPr>
-      </w:pPr>
-      <w:r>
-        <w:rPr>
-          <w:rFonts w:hint="default" w:ascii="Times New Roman" w:hAnsi="Times New Roman" w:cs="Times New Roman"/>
-          <w:sz w:val="26"/>
-          <w:szCs w:val="26"/>
-        </w:rPr>
-        <w:t>CREATE TABLE [Match] (</w:t>
-      </w:r>
-    </w:p>
-    <w:p>
-      <w:pPr>
-        <w:rPr>
-          <w:rFonts w:hint="default" w:ascii="Times New Roman" w:hAnsi="Times New Roman" w:cs="Times New Roman"/>
-          <w:sz w:val="26"/>
-          <w:szCs w:val="26"/>
-        </w:rPr>
-      </w:pPr>
-      <w:r>
-        <w:rPr>
-          <w:rFonts w:hint="default" w:ascii="Times New Roman" w:hAnsi="Times New Roman" w:cs="Times New Roman"/>
-          <w:sz w:val="26"/>
-          <w:szCs w:val="26"/>
-        </w:rPr>
-        <w:t xml:space="preserve">    MatchId INT IDENTITY(1,1) PRIMARY KEY,</w:t>
-      </w:r>
-    </w:p>
-    <w:p>
-      <w:pPr>
-        <w:rPr>
-          <w:rFonts w:hint="default" w:ascii="Times New Roman" w:hAnsi="Times New Roman" w:cs="Times New Roman"/>
-          <w:sz w:val="26"/>
-          <w:szCs w:val="26"/>
-        </w:rPr>
-      </w:pPr>
-      <w:r>
-        <w:rPr>
-          <w:rFonts w:hint="default" w:ascii="Times New Roman" w:hAnsi="Times New Roman" w:cs="Times New Roman"/>
-          <w:sz w:val="26"/>
-          <w:szCs w:val="26"/>
-        </w:rPr>
-        <w:t xml:space="preserve">    Player1Id INT NOT NULL FOREIGN KEY REFERENCES [User](UserId),</w:t>
-      </w:r>
-    </w:p>
-    <w:p>
-      <w:pPr>
-        <w:rPr>
-          <w:rFonts w:hint="default" w:ascii="Times New Roman" w:hAnsi="Times New Roman" w:cs="Times New Roman"/>
-          <w:sz w:val="26"/>
-          <w:szCs w:val="26"/>
-        </w:rPr>
-      </w:pPr>
-      <w:r>
-        <w:rPr>
-          <w:rFonts w:hint="default" w:ascii="Times New Roman" w:hAnsi="Times New Roman" w:cs="Times New Roman"/>
-          <w:sz w:val="26"/>
-          <w:szCs w:val="26"/>
-        </w:rPr>
-        <w:t xml:space="preserve">    Player2Id INT NOT NULL FOREIGN KEY REFERENCES [User](UserId),</w:t>
-      </w:r>
-    </w:p>
-    <w:p>
-      <w:pPr>
-        <w:rPr>
-          <w:rFonts w:hint="default" w:ascii="Times New Roman" w:hAnsi="Times New Roman" w:cs="Times New Roman"/>
-          <w:sz w:val="26"/>
-          <w:szCs w:val="26"/>
-        </w:rPr>
-      </w:pPr>
-      <w:r>
-        <w:rPr>
-          <w:rFonts w:hint="default" w:ascii="Times New Roman" w:hAnsi="Times New Roman" w:cs="Times New Roman"/>
-          <w:sz w:val="26"/>
-          <w:szCs w:val="26"/>
-        </w:rPr>
-        <w:t xml:space="preserve">    WinnerId INT NULL FOREIGN KEY REFERENCES [User](UserId),</w:t>
-      </w:r>
-    </w:p>
-    <w:p>
-      <w:pPr>
-        <w:rPr>
-          <w:rFonts w:hint="default" w:ascii="Times New Roman" w:hAnsi="Times New Roman" w:cs="Times New Roman"/>
-          <w:sz w:val="26"/>
-          <w:szCs w:val="26"/>
-        </w:rPr>
-      </w:pPr>
-      <w:r>
-        <w:rPr>
-          <w:rFonts w:hint="default" w:ascii="Times New Roman" w:hAnsi="Times New Roman" w:cs="Times New Roman"/>
-          <w:sz w:val="26"/>
-          <w:szCs w:val="26"/>
-        </w:rPr>
-        <w:t xml:space="preserve">    StartTime DATETIME DEFAULT GETDATE(),</w:t>
-      </w:r>
-    </w:p>
-    <w:p>
-      <w:pPr>
-        <w:rPr>
-          <w:rFonts w:hint="default" w:ascii="Times New Roman" w:hAnsi="Times New Roman" w:cs="Times New Roman"/>
-          <w:sz w:val="26"/>
-          <w:szCs w:val="26"/>
-        </w:rPr>
-      </w:pPr>
-      <w:r>
-        <w:rPr>
-          <w:rFonts w:hint="default" w:ascii="Times New Roman" w:hAnsi="Times New Roman" w:cs="Times New Roman"/>
-          <w:sz w:val="26"/>
-          <w:szCs w:val="26"/>
-        </w:rPr>
-        <w:t xml:space="preserve">    EndTime DATETIME NULL</w:t>
-      </w:r>
-    </w:p>
-    <w:p>
-      <w:pPr>
-        <w:rPr>
-          <w:rFonts w:hint="default" w:ascii="Times New Roman" w:hAnsi="Times New Roman" w:cs="Times New Roman"/>
-          <w:sz w:val="26"/>
-          <w:szCs w:val="26"/>
-        </w:rPr>
-      </w:pPr>
-      <w:r>
-        <w:rPr>
-          <w:rFonts w:hint="default" w:ascii="Times New Roman" w:hAnsi="Times New Roman" w:cs="Times New Roman"/>
-          <w:sz w:val="26"/>
-          <w:szCs w:val="26"/>
-        </w:rPr>
-        <w:t>);</w:t>
-      </w:r>
-    </w:p>
-    <w:p>
-      <w:pPr>
-        <w:rPr>
-          <w:rFonts w:hint="default" w:ascii="Times New Roman" w:hAnsi="Times New Roman" w:cs="Times New Roman"/>
-          <w:sz w:val="26"/>
-          <w:szCs w:val="26"/>
-        </w:rPr>
-      </w:pPr>
-    </w:p>
-    <w:p>
-      <w:pPr>
-        <w:rPr>
-          <w:rFonts w:hint="default" w:ascii="Times New Roman" w:hAnsi="Times New Roman" w:cs="Times New Roman"/>
-          <w:sz w:val="26"/>
-          <w:szCs w:val="26"/>
-        </w:rPr>
-      </w:pPr>
-      <w:r>
-        <w:rPr>
-          <w:rFonts w:hint="default" w:ascii="Times New Roman" w:hAnsi="Times New Roman" w:cs="Times New Roman"/>
-          <w:sz w:val="26"/>
-          <w:szCs w:val="26"/>
-        </w:rPr>
-        <w:t>CREATE TABLE [History] (</w:t>
-      </w:r>
-    </w:p>
-    <w:p>
-      <w:pPr>
-        <w:rPr>
-          <w:rFonts w:hint="default" w:ascii="Times New Roman" w:hAnsi="Times New Roman" w:cs="Times New Roman"/>
-          <w:sz w:val="26"/>
-          <w:szCs w:val="26"/>
-        </w:rPr>
-      </w:pPr>
-      <w:r>
-        <w:rPr>
-          <w:rFonts w:hint="default" w:ascii="Times New Roman" w:hAnsi="Times New Roman" w:cs="Times New Roman"/>
-          <w:sz w:val="26"/>
-          <w:szCs w:val="26"/>
-        </w:rPr>
-        <w:t xml:space="preserve">    HistoryId INT IDENTITY(1,1) PRIMARY KEY,</w:t>
-      </w:r>
-    </w:p>
-    <w:p>
-      <w:pPr>
-        <w:rPr>
-          <w:rFonts w:hint="default" w:ascii="Times New Roman" w:hAnsi="Times New Roman" w:cs="Times New Roman"/>
-          <w:sz w:val="26"/>
-          <w:szCs w:val="26"/>
-        </w:rPr>
-      </w:pPr>
-      <w:r>
-        <w:rPr>
-          <w:rFonts w:hint="default" w:ascii="Times New Roman" w:hAnsi="Times New Roman" w:cs="Times New Roman"/>
-          <w:sz w:val="26"/>
-          <w:szCs w:val="26"/>
-        </w:rPr>
-        <w:t xml:space="preserve">    MatchId INT NOT NULL FOREIGN KEY REFERENCES [Match](MatchId),</w:t>
-      </w:r>
-    </w:p>
-    <w:p>
-      <w:pPr>
-        <w:rPr>
-          <w:rFonts w:hint="default" w:ascii="Times New Roman" w:hAnsi="Times New Roman" w:cs="Times New Roman"/>
-          <w:sz w:val="26"/>
-          <w:szCs w:val="26"/>
-        </w:rPr>
-      </w:pPr>
-      <w:r>
-        <w:rPr>
-          <w:rFonts w:hint="default" w:ascii="Times New Roman" w:hAnsi="Times New Roman" w:cs="Times New Roman"/>
-          <w:sz w:val="26"/>
-          <w:szCs w:val="26"/>
-        </w:rPr>
-        <w:t xml:space="preserve">    PlayerId INT NOT NULL FOREIGN KEY REFERENCES [User](UserId),</w:t>
-      </w:r>
-    </w:p>
-    <w:p>
-      <w:pPr>
-        <w:rPr>
-          <w:rFonts w:hint="default" w:ascii="Times New Roman" w:hAnsi="Times New Roman" w:cs="Times New Roman"/>
-          <w:sz w:val="26"/>
-          <w:szCs w:val="26"/>
-        </w:rPr>
-      </w:pPr>
-      <w:r>
-        <w:rPr>
-          <w:rFonts w:hint="default" w:ascii="Times New Roman" w:hAnsi="Times New Roman" w:cs="Times New Roman"/>
-          <w:sz w:val="26"/>
-          <w:szCs w:val="26"/>
-        </w:rPr>
-        <w:t xml:space="preserve">    MoveX INT NOT NULL,</w:t>
-      </w:r>
-    </w:p>
-    <w:p>
-      <w:pPr>
-        <w:rPr>
-          <w:rFonts w:hint="default" w:ascii="Times New Roman" w:hAnsi="Times New Roman" w:cs="Times New Roman"/>
-          <w:sz w:val="26"/>
-          <w:szCs w:val="26"/>
-        </w:rPr>
-      </w:pPr>
-      <w:r>
-        <w:rPr>
-          <w:rFonts w:hint="default" w:ascii="Times New Roman" w:hAnsi="Times New Roman" w:cs="Times New Roman"/>
-          <w:sz w:val="26"/>
-          <w:szCs w:val="26"/>
-        </w:rPr>
-        <w:t xml:space="preserve">    MoveY INT NOT NULL,</w:t>
-      </w:r>
-    </w:p>
-    <w:p>
-      <w:pPr>
-        <w:rPr>
-          <w:rFonts w:hint="default" w:ascii="Times New Roman" w:hAnsi="Times New Roman" w:cs="Times New Roman"/>
-          <w:sz w:val="26"/>
-          <w:szCs w:val="26"/>
-        </w:rPr>
-      </w:pPr>
-      <w:r>
-        <w:rPr>
-          <w:rFonts w:hint="default" w:ascii="Times New Roman" w:hAnsi="Times New Roman" w:cs="Times New Roman"/>
-          <w:sz w:val="26"/>
-          <w:szCs w:val="26"/>
-        </w:rPr>
-        <w:t xml:space="preserve">    StepOrder INT NOT NULL</w:t>
-      </w:r>
-    </w:p>
-    <w:p>
-      <w:pPr>
-        <w:rPr>
-          <w:rFonts w:hint="default" w:ascii="Times New Roman" w:hAnsi="Times New Roman" w:cs="Times New Roman"/>
-          <w:sz w:val="26"/>
-          <w:szCs w:val="26"/>
-        </w:rPr>
-      </w:pPr>
-      <w:r>
-        <w:rPr>
-          <w:rFonts w:hint="default" w:ascii="Times New Roman" w:hAnsi="Times New Roman" w:cs="Times New Roman"/>
-          <w:sz w:val="26"/>
-          <w:szCs w:val="26"/>
-        </w:rPr>
-        <w:t>);</w:t>
-      </w:r>
-    </w:p>
-    <w:p>
-      <w:pPr>
-        <w:rPr>
-          <w:rFonts w:hint="default" w:ascii="Times New Roman" w:hAnsi="Times New Roman" w:cs="Times New Roman"/>
-          <w:sz w:val="26"/>
-          <w:szCs w:val="26"/>
-        </w:rPr>
-      </w:pPr>
-    </w:p>
-    <w:p>
-      <w:pPr>
-        <w:rPr>
-          <w:rFonts w:hint="default" w:ascii="Times New Roman" w:hAnsi="Times New Roman" w:cs="Times New Roman"/>
-          <w:sz w:val="26"/>
-          <w:szCs w:val="26"/>
-        </w:rPr>
-      </w:pPr>
-      <w:r>
-        <w:rPr>
-          <w:rFonts w:hint="default" w:ascii="Times New Roman" w:hAnsi="Times New Roman" w:cs="Times New Roman"/>
-          <w:sz w:val="26"/>
-          <w:szCs w:val="26"/>
-        </w:rPr>
-        <w:t>Đây là ERD mình vẽ, leader check lỗi giúp mình ạ</w:t>
-      </w:r>
-    </w:p>
-    <w:p>
-      <w:pPr>
-        <w:rPr>
-          <w:rFonts w:hint="default" w:ascii="Times New Roman" w:hAnsi="Times New Roman" w:cs="Times New Roman"/>
-          <w:sz w:val="26"/>
-          <w:szCs w:val="26"/>
-        </w:rPr>
-      </w:pPr>
-      <w:r>
-        <w:rPr>
-          <w:rFonts w:hint="default" w:ascii="Times New Roman" w:hAnsi="Times New Roman" w:cs="Times New Roman"/>
-          <w:sz w:val="26"/>
-          <w:szCs w:val="26"/>
-        </w:rPr>
-        <w:t>&lt;img width="780" height="429" alt="Image" src="https://github.com/user-attachments/assets/7e4d27f0-d788-4e7a-a155-b0fa66cd8e66" /&gt;</w:t>
-      </w:r>
-    </w:p>
-    <w:p>
-      <w:pPr>
-        <w:rPr>
-          <w:rFonts w:hint="default" w:ascii="Times New Roman" w:hAnsi="Times New Roman" w:cs="Times New Roman"/>
-          <w:sz w:val="26"/>
-          <w:szCs w:val="26"/>
-        </w:rPr>
-      </w:pPr>
-    </w:p>
-    <w:p>
-      <w:pPr>
-        <w:rPr>
-          <w:rFonts w:hint="default" w:ascii="Times New Roman" w:hAnsi="Times New Roman" w:cs="Times New Roman"/>
-          <w:sz w:val="26"/>
-          <w:szCs w:val="26"/>
-        </w:rPr>
-      </w:pPr>
       <w:r>
         <w:rPr>
           <w:rFonts w:hint="default" w:ascii="Times New Roman" w:hAnsi="Times New Roman" w:cs="Times New Roman"/>
@@ -1221,7 +1265,7 @@
     <w:lsdException w:unhideWhenUsed="0" w:uiPriority="0" w:semiHidden="0" w:name="HTML Sample"/>
     <w:lsdException w:unhideWhenUsed="0" w:uiPriority="0" w:semiHidden="0" w:name="HTML Typewriter"/>
     <w:lsdException w:unhideWhenUsed="0" w:uiPriority="0" w:semiHidden="0" w:name="HTML Variable"/>
-    <w:lsdException w:unhideWhenUsed="0" w:uiPriority="0" w:name="Normal Table"/>
+    <w:lsdException w:qFormat="1" w:unhideWhenUsed="0" w:uiPriority="0" w:name="Normal Table"/>
     <w:lsdException w:unhideWhenUsed="0" w:uiPriority="0" w:semiHidden="0" w:name="annotation subject"/>
     <w:lsdException w:unhideWhenUsed="0" w:uiPriority="0" w:semiHidden="0" w:name="Table Simple 1"/>
     <w:lsdException w:unhideWhenUsed="0" w:uiPriority="0" w:semiHidden="0" w:name="Table Simple 2"/>
@@ -1385,6 +1429,7 @@
   <w:style w:type="table" w:default="1" w:styleId="3">
     <w:name w:val="Normal Table"/>
     <w:semiHidden/>
+    <w:qFormat/>
     <w:uiPriority w:val="0"/>
     <w:tblPr>
       <w:tblCellMar>

</xml_diff>